<commit_message>
Chapter 3 draft: conclusion as paragraphs
Co-Authored-By: Claude Opus 5.5 <noreply@anthropic.com>
Claude-Session: https://claude.ai/code/session_01VBZf6oKSsJ7KuyzUF78Kfz
</commit_message>
<xml_diff>
--- a/docs/AMSON-Chapter3-Draft.docx
+++ b/docs/AMSON-Chapter3-Draft.docx
@@ -3709,7 +3709,7 @@
     <w:bookmarkEnd w:id="111"/>
     <w:bookmarkEnd w:id="112"/>
     <w:bookmarkEnd w:id="113"/>
-    <w:bookmarkStart w:id="117" w:name="conclusion"/>
+    <w:bookmarkStart w:id="114" w:name="conclusion"/>
     <w:p>
       <w:pPr>
         <w:pStyle w:val="Heading1"/>
@@ -3718,245 +3718,39 @@
         <w:t xml:space="preserve">CONCLUSION</w:t>
       </w:r>
     </w:p>
-    <w:bookmarkStart w:id="114" w:name="summary"/>
-    <w:p>
-      <w:pPr>
-        <w:pStyle w:val="Heading2"/>
-      </w:pPr>
-      <w:r>
-        <w:t xml:space="preserve">Summary</w:t>
-      </w:r>
-    </w:p>
     <w:p>
       <w:pPr>
         <w:pStyle w:val="FirstParagraph"/>
       </w:pPr>
       <w:r>
-        <w:t xml:space="preserve">The study developed a Web-Based Sales and Inventory Management System with Integrated Real-Time Expiry Monitoring for the Las Piñas branch of Amson Pharmaceuticals, which previously relied on handwritten invoices, Excel re-encoding, ordering through personal messaging applications, and manual expiry monitoring. The system was developed using the Agile methodology, tested against its functional and non-functional requirements, and deployed to the branch on October 22, 2026. It was evaluated by 53 respondents, consisting of the Branch Manager, the Technical Staff, the Sales Staff, and 50 customers, using the ISO/IEC 25010 quality characteristics and the Technology Acceptance Model.</w:t>
-      </w:r>
-    </w:p>
-    <w:p>
-      <w:pPr>
-        <w:pStyle w:val="BodyText"/>
-      </w:pPr>
-      <w:r>
-        <w:t xml:space="preserve">First, the customer e-commerce platform allowed customers to browse products, order online, pay through QR Ph, pre-order prescription medicines for pick-up, track their orders, and ask the AI chat assistant, and customers rated it Good to Excellent, with 40 of 50 rating their overall satisfaction as Excellent. Second, the sales and inventory module recorded every sale with a printed receipt and managed stock by batch and expiry date with FEFO deduction and automatic near-expiry and bad-order flagging, and the staff rated the accuracy of the stock count and the expiry alerts Good to Excellent. Third, the administrative portal provided role-based access, Branch Manager-only price control, an audit log, and exportable daily and monthly reports with batch numbers and expiry dates, which the Branch Manager rated Excellent. Fourth, the evaluation showed average ratings of 4.00 to 5.00 across all ISO/IEC 25010 characteristics for every respondent group.</w:t>
+        <w:t xml:space="preserve">The development and deployment of the Web-Based Sales and Inventory Management System with Integrated Real-Time Expiry Monitoring for Amson Pharmaceuticals effectively resolved the operational problems of the Las Piñas branch caused by handwritten invoices, Excel re-encoding, ordering through personal messaging applications, and manual expiry monitoring. The system was developed using the Agile methodology, tested against its functional and non-functional requirements, and deployed to the branch on October 22, 2026. It was evaluated by 53 respondents, consisting of the Branch Manager, the Technical Staff, the Sales Staff, and 50 customers, using the ISO/IEC 25010 quality characteristics and the Technology Acceptance Model. All respondent groups gave average ratings of 4.00 to 5.00 across functional suitability, performance efficiency, usability, reliability, and security. Customers rated the system highest in reliability at 4.82, and 40 of 50 rated their overall satisfaction as Excellent.</w:t>
+      </w:r>
+    </w:p>
+    <w:p>
+      <w:pPr>
+        <w:pStyle w:val="BodyText"/>
+      </w:pPr>
+      <w:r>
+        <w:t xml:space="preserve">From these findings, the researchers conclude that all four objectives of the study were achieved. First, the customer e-commerce platform enables retail customers to browse products, place orders online, access AI-powered chat support, and pre-order prescription medicines for in-store pick-up, reducing the branch’s reliance on personal messaging applications. Second, the sales and inventory module generates a transaction record and printed receipt for every sale, applies FEFO stock prioritization, monitors inventory in real time with expiry and low-stock alerts, and removes near-expiry products from sellable inventory, so the prevention of expired products no longer depends only on the staff’s physical vigilance. Third, the administrative portal allows authorized users to manage products and prices through role-based access, handle both online and walk-in transactions, and generate exportable daily and monthly sales and inventory reports with batch numbers and expiration details for main office submission, while recording sensitive actions in the audit log. Fourth, the evaluation shows that the end-users accept the system as useful and easy to use, and that it meets the ISO/IEC 25010 quality characteristics.</w:t>
+      </w:r>
+    </w:p>
+    <w:p>
+      <w:pPr>
+        <w:pStyle w:val="BodyText"/>
+      </w:pPr>
+      <w:r>
+        <w:t xml:space="preserve">Based on the survey results, the researchers recommend improving the product search in the point-of-sale through barcode scanning or search by generic name, since the Sales Staff rated finding a product and making a sale as Fair. New products and price changes should also appear more quickly on all screens, and account security should be strengthened through additional login verification for staff, since account safety received the lowest rating from the Branch Manager. The AI chat assistant’s answers should also be improved, as it received the most Fair ratings in the user survey.</w:t>
+      </w:r>
+    </w:p>
+    <w:p>
+      <w:pPr>
+        <w:pStyle w:val="BodyText"/>
+      </w:pPr>
+      <w:r>
+        <w:t xml:space="preserve">Beyond the scope of this study, future researchers and developers are encouraged to register the system with the Bureau of Internal Revenue so that its receipts and invoices can serve as official receipts with VAT computation, and to add multi-branch support for the planned Sta. Cruz branch and the main office. Integration with the branch’s existing point-of-sale system would remove the need to record sales and stock in two systems, while connecting a payment gateway and a courier API would replace manual screenshot verification and manual Lalamove booking. Offline support for when the internet connection is down, and an upgrade to a paid cloud plan as transactions grow, would further improve the system’s usage limits and data backup.</w:t>
       </w:r>
     </w:p>
     <w:bookmarkEnd w:id="114"/>
-    <w:bookmarkStart w:id="115" w:name="conclusions"/>
-    <w:p>
-      <w:pPr>
-        <w:pStyle w:val="Heading2"/>
-      </w:pPr>
-      <w:r>
-        <w:t xml:space="preserve">Conclusions</w:t>
-      </w:r>
-    </w:p>
-    <w:p>
-      <w:pPr>
-        <w:pStyle w:val="FirstParagraph"/>
-      </w:pPr>
-      <w:r>
-        <w:t xml:space="preserve">Based on the findings, the following conclusions are drawn:</w:t>
-      </w:r>
-    </w:p>
-    <w:p>
-      <w:pPr>
-        <w:numPr>
-          <w:ilvl w:val="0"/>
-          <w:numId w:val="1032"/>
-        </w:numPr>
-        <w:pStyle w:val="Compact"/>
-      </w:pPr>
-      <w:r>
-        <w:t xml:space="preserve">The first objective was achieved. The customer e-commerce platform successfully enables retail customers to browse products, place orders online, access AI-powered chat support, and pre-order prescription medicines for in-store pick-up, reducing the branch’s reliance on personal messaging applications.</w:t>
-      </w:r>
-    </w:p>
-    <w:p>
-      <w:pPr>
-        <w:numPr>
-          <w:ilvl w:val="0"/>
-          <w:numId w:val="1032"/>
-        </w:numPr>
-        <w:pStyle w:val="Compact"/>
-      </w:pPr>
-      <w:r>
-        <w:t xml:space="preserve">The second objective was achieved. The sales and inventory module automatically generates a transaction record for every sale, applies FEFO stock prioritization, monitors inventory in real time with expiry and low-stock alerts, and removes near-expiry products from sellable inventory, so the prevention of expired products no longer relies only on the staff’s physical vigilance.</w:t>
-      </w:r>
-    </w:p>
-    <w:p>
-      <w:pPr>
-        <w:numPr>
-          <w:ilvl w:val="0"/>
-          <w:numId w:val="1032"/>
-        </w:numPr>
-        <w:pStyle w:val="Compact"/>
-      </w:pPr>
-      <w:r>
-        <w:t xml:space="preserve">The third objective was achieved. The administrative portal allows authorized users to manage products and prices through role-based access, handle both online and walk-in transactions, and generate exportable daily and monthly sales and inventory reports with batch numbers and expiration details for main office submission, while recording sensitive actions in the audit log.</w:t>
-      </w:r>
-    </w:p>
-    <w:p>
-      <w:pPr>
-        <w:numPr>
-          <w:ilvl w:val="0"/>
-          <w:numId w:val="1032"/>
-        </w:numPr>
-        <w:pStyle w:val="Compact"/>
-      </w:pPr>
-      <w:r>
-        <w:t xml:space="preserve">The fourth objective was achieved. The evaluation using the Technology Acceptance Model and ISO/IEC 25010 shows that the end-users accept the system as useful and easy to use, and that the system meets the quality characteristics of functional suitability, performance efficiency, usability, reliability, and security.</w:t>
-      </w:r>
-    </w:p>
-    <w:bookmarkEnd w:id="115"/>
-    <w:bookmarkStart w:id="116" w:name="recommendations"/>
-    <w:p>
-      <w:pPr>
-        <w:pStyle w:val="Heading2"/>
-      </w:pPr>
-      <w:r>
-        <w:t xml:space="preserve">Recommendations</w:t>
-      </w:r>
-    </w:p>
-    <w:p>
-      <w:pPr>
-        <w:pStyle w:val="FirstParagraph"/>
-      </w:pPr>
-      <w:r>
-        <w:t xml:space="preserve">Based on the results of the survey, the researchers recommend the following improvements to the system:</w:t>
-      </w:r>
-    </w:p>
-    <w:p>
-      <w:pPr>
-        <w:numPr>
-          <w:ilvl w:val="0"/>
-          <w:numId w:val="1033"/>
-        </w:numPr>
-        <w:pStyle w:val="Compact"/>
-      </w:pPr>
-      <w:r>
-        <w:t xml:space="preserve">Improve the product search in the point-of-sale, such as adding barcode scanning or search by generic name, since the Sales Staff rated finding a product and making a sale as Fair.</w:t>
-      </w:r>
-    </w:p>
-    <w:p>
-      <w:pPr>
-        <w:numPr>
-          <w:ilvl w:val="0"/>
-          <w:numId w:val="1033"/>
-        </w:numPr>
-        <w:pStyle w:val="Compact"/>
-      </w:pPr>
-      <w:r>
-        <w:t xml:space="preserve">Make new products and price changes appear more quickly on all screens, since keeping up with catalog changes received a Fair rating from the Sales Staff.</w:t>
-      </w:r>
-    </w:p>
-    <w:p>
-      <w:pPr>
-        <w:numPr>
-          <w:ilvl w:val="0"/>
-          <w:numId w:val="1033"/>
-        </w:numPr>
-        <w:pStyle w:val="Compact"/>
-      </w:pPr>
-      <w:r>
-        <w:t xml:space="preserve">Strengthen account security, such as enabling additional login verification for staff, since account safety received the lowest rating from the Branch Manager.</w:t>
-      </w:r>
-    </w:p>
-    <w:p>
-      <w:pPr>
-        <w:numPr>
-          <w:ilvl w:val="0"/>
-          <w:numId w:val="1033"/>
-        </w:numPr>
-        <w:pStyle w:val="Compact"/>
-      </w:pPr>
-      <w:r>
-        <w:t xml:space="preserve">Improve the AI chat assistant’s answers, since it received the most Fair ratings in the user survey.</w:t>
-      </w:r>
-    </w:p>
-    <w:p>
-      <w:pPr>
-        <w:pStyle w:val="FirstParagraph"/>
-      </w:pPr>
-      <w:r>
-        <w:t xml:space="preserve">Based on the research, the following gaps were not achieved within the scope of the study and are recommended for future researchers and developers:</w:t>
-      </w:r>
-    </w:p>
-    <w:p>
-      <w:pPr>
-        <w:numPr>
-          <w:ilvl w:val="0"/>
-          <w:numId w:val="1034"/>
-        </w:numPr>
-        <w:pStyle w:val="Compact"/>
-      </w:pPr>
-      <w:r>
-        <w:t xml:space="preserve">Registration of the system with the Bureau of Internal Revenue (BIR) so that its receipts and invoices can serve as official receipts, including VAT computation.</w:t>
-      </w:r>
-    </w:p>
-    <w:p>
-      <w:pPr>
-        <w:numPr>
-          <w:ilvl w:val="0"/>
-          <w:numId w:val="1034"/>
-        </w:numPr>
-        <w:pStyle w:val="Compact"/>
-      </w:pPr>
-      <w:r>
-        <w:t xml:space="preserve">Multi-branch support, so that the system can serve the planned Sta. Cruz branch and allow the main office to monitor all branches in one place.</w:t>
-      </w:r>
-    </w:p>
-    <w:p>
-      <w:pPr>
-        <w:numPr>
-          <w:ilvl w:val="0"/>
-          <w:numId w:val="1034"/>
-        </w:numPr>
-        <w:pStyle w:val="Compact"/>
-      </w:pPr>
-      <w:r>
-        <w:t xml:space="preserve">Integration with the branch’s existing point-of-sale system, so that sales and stock do not need to be recorded in two systems.</w:t>
-      </w:r>
-    </w:p>
-    <w:p>
-      <w:pPr>
-        <w:numPr>
-          <w:ilvl w:val="0"/>
-          <w:numId w:val="1034"/>
-        </w:numPr>
-        <w:pStyle w:val="Compact"/>
-      </w:pPr>
-      <w:r>
-        <w:t xml:space="preserve">Integration with a payment gateway and a courier API for automatic payment confirmation and delivery booking, in place of manual screenshot verification and manual Lalamove booking.</w:t>
-      </w:r>
-    </w:p>
-    <w:p>
-      <w:pPr>
-        <w:numPr>
-          <w:ilvl w:val="0"/>
-          <w:numId w:val="1034"/>
-        </w:numPr>
-        <w:pStyle w:val="Compact"/>
-      </w:pPr>
-      <w:r>
-        <w:t xml:space="preserve">Offline support, so that sales can still be recorded when the internet connection is down.</w:t>
-      </w:r>
-    </w:p>
-    <w:p>
-      <w:pPr>
-        <w:numPr>
-          <w:ilvl w:val="0"/>
-          <w:numId w:val="1034"/>
-        </w:numPr>
-        <w:pStyle w:val="Compact"/>
-      </w:pPr>
-      <w:r>
-        <w:t xml:space="preserve">Upgrading to a paid cloud plan as transactions grow, to raise usage limits and add automatic database backups.</w:t>
-      </w:r>
-    </w:p>
-    <w:bookmarkEnd w:id="116"/>
-    <w:bookmarkEnd w:id="117"/>
     <w:sectPr/>
   </w:body>
 </w:document>
@@ -4993,96 +4787,6 @@
     </w:lvlOverride>
   </w:num>
   <w:num w:numId="1031">
-    <w:abstractNumId w:val="99411"/>
-    <w:lvlOverride w:ilvl="0">
-      <w:startOverride w:val="1"/>
-    </w:lvlOverride>
-    <w:lvlOverride w:ilvl="1">
-      <w:startOverride w:val="1"/>
-    </w:lvlOverride>
-    <w:lvlOverride w:ilvl="2">
-      <w:startOverride w:val="1"/>
-    </w:lvlOverride>
-    <w:lvlOverride w:ilvl="3">
-      <w:startOverride w:val="1"/>
-    </w:lvlOverride>
-    <w:lvlOverride w:ilvl="4">
-      <w:startOverride w:val="1"/>
-    </w:lvlOverride>
-    <w:lvlOverride w:ilvl="5">
-      <w:startOverride w:val="1"/>
-    </w:lvlOverride>
-    <w:lvlOverride w:ilvl="6">
-      <w:startOverride w:val="1"/>
-    </w:lvlOverride>
-    <w:lvlOverride w:ilvl="7">
-      <w:startOverride w:val="1"/>
-    </w:lvlOverride>
-    <w:lvlOverride w:ilvl="8">
-      <w:startOverride w:val="1"/>
-    </w:lvlOverride>
-  </w:num>
-  <w:num w:numId="1032">
-    <w:abstractNumId w:val="99411"/>
-    <w:lvlOverride w:ilvl="0">
-      <w:startOverride w:val="1"/>
-    </w:lvlOverride>
-    <w:lvlOverride w:ilvl="1">
-      <w:startOverride w:val="1"/>
-    </w:lvlOverride>
-    <w:lvlOverride w:ilvl="2">
-      <w:startOverride w:val="1"/>
-    </w:lvlOverride>
-    <w:lvlOverride w:ilvl="3">
-      <w:startOverride w:val="1"/>
-    </w:lvlOverride>
-    <w:lvlOverride w:ilvl="4">
-      <w:startOverride w:val="1"/>
-    </w:lvlOverride>
-    <w:lvlOverride w:ilvl="5">
-      <w:startOverride w:val="1"/>
-    </w:lvlOverride>
-    <w:lvlOverride w:ilvl="6">
-      <w:startOverride w:val="1"/>
-    </w:lvlOverride>
-    <w:lvlOverride w:ilvl="7">
-      <w:startOverride w:val="1"/>
-    </w:lvlOverride>
-    <w:lvlOverride w:ilvl="8">
-      <w:startOverride w:val="1"/>
-    </w:lvlOverride>
-  </w:num>
-  <w:num w:numId="1033">
-    <w:abstractNumId w:val="99411"/>
-    <w:lvlOverride w:ilvl="0">
-      <w:startOverride w:val="1"/>
-    </w:lvlOverride>
-    <w:lvlOverride w:ilvl="1">
-      <w:startOverride w:val="1"/>
-    </w:lvlOverride>
-    <w:lvlOverride w:ilvl="2">
-      <w:startOverride w:val="1"/>
-    </w:lvlOverride>
-    <w:lvlOverride w:ilvl="3">
-      <w:startOverride w:val="1"/>
-    </w:lvlOverride>
-    <w:lvlOverride w:ilvl="4">
-      <w:startOverride w:val="1"/>
-    </w:lvlOverride>
-    <w:lvlOverride w:ilvl="5">
-      <w:startOverride w:val="1"/>
-    </w:lvlOverride>
-    <w:lvlOverride w:ilvl="6">
-      <w:startOverride w:val="1"/>
-    </w:lvlOverride>
-    <w:lvlOverride w:ilvl="7">
-      <w:startOverride w:val="1"/>
-    </w:lvlOverride>
-    <w:lvlOverride w:ilvl="8">
-      <w:startOverride w:val="1"/>
-    </w:lvlOverride>
-  </w:num>
-  <w:num w:numId="1034">
     <w:abstractNumId w:val="99411"/>
     <w:lvlOverride w:ilvl="0">
       <w:startOverride w:val="1"/>

</xml_diff>